<commit_message>
docs: ajusta documento da entrega sem vídeo e sem projeto no LinkedIn
Seção 5 passa a descrever os links do site e dos READMEs para o
LinkedIn; seção 6 vira checklist de revisão final.
</commit_message>
<xml_diff>
--- a/02_Disciplinas_Atuais/Bootcamp_I/Atividades_e_Entregas/Etapa_Intermediaria_Repositorio_com_Versionamento.docx
+++ b/02_Disciplinas_Atuais/Bootcamp_I/Atividades_e_Entregas/Etapa_Intermediaria_Repositorio_com_Versionamento.docx
@@ -252,7 +252,7 @@
             </w:tcMar>
           </w:tcPr>
           <w:p>
-            <w:hyperlink w:history="1" r:id="rIdcye5z8wlnuaplvcf5t8ua">
+            <w:hyperlink w:history="1" r:id="rIdowxk276slgon5qyygy6yn">
               <w:r>
                 <w:rPr>
                   <w:rFonts w:ascii="Arial" w:cs="Arial" w:eastAsia="Arial" w:hAnsi="Arial"/>
@@ -312,7 +312,7 @@
             </w:tcMar>
           </w:tcPr>
           <w:p>
-            <w:hyperlink w:history="1" r:id="rId0dewpnzdxolho4qiuhace">
+            <w:hyperlink w:history="1" r:id="rIdkdryympcny7smfxtmrde7">
               <w:r>
                 <w:rPr>
                   <w:rFonts w:ascii="Arial" w:cs="Arial" w:eastAsia="Arial" w:hAnsi="Arial"/>
@@ -372,7 +372,7 @@
             </w:tcMar>
           </w:tcPr>
           <w:p>
-            <w:hyperlink w:history="1" r:id="rIduti6r9c-wta4qljrlx6s-">
+            <w:hyperlink w:history="1" r:id="rIdzluf2ajvvdaawagzn_l3s">
               <w:r>
                 <w:rPr>
                   <w:rFonts w:ascii="Arial" w:cs="Arial" w:eastAsia="Arial" w:hAnsi="Arial"/>
@@ -382,67 +382,6 @@
                 <w:t xml:space="preserve">https://www.linkedin.com/in/matheus-luigi-a7bb22220/</w:t>
               </w:r>
             </w:hyperlink>
-          </w:p>
-        </w:tc>
-      </w:tr>
-      <w:tr>
-        <w:tc>
-          <w:tcPr>
-            <w:tcW w:type="dxa" w:w="2800"/>
-            <w:tcBorders>
-              <w:top w:val="single" w:color="D0CCE6" w:sz="4"/>
-              <w:left w:val="single" w:color="D0CCE6" w:sz="4"/>
-              <w:bottom w:val="single" w:color="D0CCE6" w:sz="4"/>
-              <w:right w:val="single" w:color="D0CCE6" w:sz="4"/>
-            </w:tcBorders>
-            <w:tcMar>
-              <w:top w:type="dxa" w:w="80"/>
-              <w:left w:type="dxa" w:w="120"/>
-              <w:bottom w:type="dxa" w:w="80"/>
-              <w:right w:type="dxa" w:w="120"/>
-            </w:tcMar>
-          </w:tcPr>
-          <w:p>
-            <w:r>
-              <w:rPr>
-                <w:rFonts w:ascii="Arial" w:cs="Arial" w:eastAsia="Arial" w:hAnsi="Arial"/>
-                <w:b w:val="false"/>
-                <w:bCs w:val="false"/>
-                <w:sz w:val="20"/>
-                <w:szCs w:val="20"/>
-              </w:rPr>
-              <w:t xml:space="preserve">Vídeo de apresentação (YouTube)</w:t>
-            </w:r>
-          </w:p>
-        </w:tc>
-        <w:tc>
-          <w:tcPr>
-            <w:tcW w:type="dxa" w:w="6226"/>
-            <w:tcBorders>
-              <w:top w:val="single" w:color="D0CCE6" w:sz="4"/>
-              <w:left w:val="single" w:color="D0CCE6" w:sz="4"/>
-              <w:bottom w:val="single" w:color="D0CCE6" w:sz="4"/>
-              <w:right w:val="single" w:color="D0CCE6" w:sz="4"/>
-            </w:tcBorders>
-            <w:tcMar>
-              <w:top w:type="dxa" w:w="80"/>
-              <w:left w:type="dxa" w:w="120"/>
-              <w:bottom w:type="dxa" w:w="80"/>
-              <w:right w:type="dxa" w:w="120"/>
-            </w:tcMar>
-          </w:tcPr>
-          <w:p>
-            <w:r>
-              <w:rPr>
-                <w:rFonts w:ascii="Arial" w:cs="Arial" w:eastAsia="Arial" w:hAnsi="Arial"/>
-                <w:i/>
-                <w:iCs/>
-                <w:color w:val="555555"/>
-                <w:sz w:val="20"/>
-                <w:szCs w:val="20"/>
-              </w:rPr>
-              <w:t xml:space="preserve">[inserir o link do vídeo após a publicação]</w:t>
-            </w:r>
           </w:p>
         </w:tc>
       </w:tr>
@@ -941,7 +880,7 @@
           </w:pPr>
           <w:hyperlink w:history="1" w:anchor="_Toc21">
             <w:r>
-              <w:t xml:space="preserve">6. Revisão Final e Apresentação</w:t>
+              <w:t xml:space="preserve">6. Revisão Final</w:t>
             </w:r>
             <w:r>
               <w:tab/>
@@ -949,6 +888,29 @@
             <w:r>
               <w:fldChar w:fldCharType="begin" w:dirty="true"/>
               <w:instrText xml:space="preserve">PAGEREF _Toc21 \h</w:instrText>
+              <w:fldChar w:fldCharType="separate"/>
+              <w:fldChar w:fldCharType="end"/>
+            </w:r>
+          </w:hyperlink>
+        </w:p>
+        <w:p>
+          <w:pPr>
+            <w:pStyle w:val="TOC2"/>
+            <w:tabs>
+              <w:tab w:val="right" w:pos="9026" w:leader="dot"/>
+            </w:tabs>
+            <w:ind w:left="220"/>
+          </w:pPr>
+          <w:hyperlink w:history="1" w:anchor="_Toc22">
+            <w:r>
+              <w:t xml:space="preserve">Principais projetos do repositório</w:t>
+            </w:r>
+            <w:r>
+              <w:tab/>
+            </w:r>
+            <w:r>
+              <w:fldChar w:fldCharType="begin" w:dirty="true"/>
+              <w:instrText xml:space="preserve">PAGEREF _Toc22 \h</w:instrText>
               <w:fldChar w:fldCharType="separate"/>
               <w:fldChar w:fldCharType="end"/>
             </w:r>
@@ -961,7 +923,7 @@
               <w:tab w:val="right" w:pos="9026" w:leader="dot"/>
             </w:tabs>
           </w:pPr>
-          <w:hyperlink w:history="1" w:anchor="_Toc22">
+          <w:hyperlink w:history="1" w:anchor="_Toc23">
             <w:r>
               <w:t xml:space="preserve">Atendimento aos Critérios de Avaliação</w:t>
             </w:r>
@@ -970,7 +932,7 @@
             </w:r>
             <w:r>
               <w:fldChar w:fldCharType="begin" w:dirty="true"/>
-              <w:instrText xml:space="preserve">PAGEREF _Toc22 \h</w:instrText>
+              <w:instrText xml:space="preserve">PAGEREF _Toc23 \h</w:instrText>
               <w:fldChar w:fldCharType="separate"/>
               <w:fldChar w:fldCharType="end"/>
             </w:r>
@@ -1025,7 +987,7 @@
         <w:rPr>
           <w:rFonts w:ascii="Arial" w:cs="Arial" w:eastAsia="Arial" w:hAnsi="Arial"/>
         </w:rPr>
-        <w:t xml:space="preserve">Esta entrega transforma o Study Hub, criado na Fase 1, em um repositório público, organizado e versionado com Git, que reúne projetos acadêmicos e pessoais, documenta cada projeto com README e publica um portfólio no GitHub Pages integrado ao LinkedIn.</w:t>
+        <w:t xml:space="preserve">Esta entrega transforma o Study Hub, criado na Fase 1, em um repositório público, organizado e versionado com Git, que reúne projetos acadêmicos e pessoais, documenta cada projeto com README e publica um portfólio no GitHub Pages com links para o perfil profissional no LinkedIn.</w:t>
       </w:r>
     </w:p>
     <w:p>
@@ -2679,7 +2641,7 @@
         </w:rPr>
         <w:t xml:space="preserve">Histórico completo: </w:t>
       </w:r>
-      <w:hyperlink w:history="1" r:id="rIdl3pkqv_w-oybyywwxtabu">
+      <w:hyperlink w:history="1" r:id="rIdb34lpedvhtdjygfx9fqq8">
         <w:r>
           <w:rPr>
             <w:rFonts w:ascii="Arial" w:cs="Arial" w:eastAsia="Arial" w:hAnsi="Arial"/>
@@ -2695,7 +2657,7 @@
         </w:rPr>
         <w:t xml:space="preserve"> e </w:t>
       </w:r>
-      <w:hyperlink w:history="1" r:id="rIdthqqoq7oekkmmkk_lmt6c">
+      <w:hyperlink w:history="1" r:id="rIdqb21domhdkluhgzuszoub">
         <w:r>
           <w:rPr>
             <w:rFonts w:ascii="Arial" w:cs="Arial" w:eastAsia="Arial" w:hAnsi="Arial"/>
@@ -3249,7 +3211,7 @@
         </w:rPr>
         <w:t xml:space="preserve">Endereço publicado: </w:t>
       </w:r>
-      <w:hyperlink w:history="1" r:id="rIdirbsoq951nmvi2bs_jm3-">
+      <w:hyperlink w:history="1" r:id="rIdody8jw90taudpkzocahln">
         <w:r>
           <w:rPr>
             <w:rFonts w:ascii="Arial" w:cs="Arial" w:eastAsia="Arial" w:hAnsi="Arial"/>
@@ -3765,9 +3727,9 @@
         <w:rPr>
           <w:rFonts w:ascii="Arial" w:cs="Arial" w:eastAsia="Arial" w:hAnsi="Arial"/>
         </w:rPr>
-        <w:t xml:space="preserve">O repositório é público e pode ser acessado por qualquer pessoa pelo link </w:t>
-      </w:r>
-      <w:hyperlink w:history="1" r:id="rIdcs9ctxd-b0brpijjaesre">
+        <w:t xml:space="preserve">O repositório é público e pode ser acessado por qualquer pessoa, sem login, pelo link </w:t>
+      </w:r>
+      <w:hyperlink w:history="1" r:id="rId438vrylmumn_synyixjbo">
         <w:r>
           <w:rPr>
             <w:rFonts w:ascii="Arial" w:cs="Arial" w:eastAsia="Arial" w:hAnsi="Arial"/>
@@ -3786,6 +3748,33 @@
     </w:p>
     <w:p>
       <w:pPr>
+        <w:spacing w:after="120" w:line="300"/>
+      </w:pPr>
+      <w:r>
+        <w:rPr>
+          <w:rFonts w:ascii="Arial" w:cs="Arial" w:eastAsia="Arial" w:hAnsi="Arial"/>
+        </w:rPr>
+        <w:t xml:space="preserve">O portfólio publicado também é público: </w:t>
+      </w:r>
+      <w:hyperlink w:history="1" r:id="rIdwuafuazc4k-t4bh01padh">
+        <w:r>
+          <w:rPr>
+            <w:rFonts w:ascii="Arial" w:cs="Arial" w:eastAsia="Arial" w:hAnsi="Arial"/>
+            <w:color w:val="5B3FD6"/>
+            <w:u w:val="single"/>
+          </w:rPr>
+          <w:t xml:space="preserve">https://matheusluigi.github.io/Meu_Study_Hub_TI/</w:t>
+        </w:r>
+      </w:hyperlink>
+      <w:r>
+        <w:rPr>
+          <w:rFonts w:ascii="Arial" w:cs="Arial" w:eastAsia="Arial" w:hAnsi="Arial"/>
+        </w:rPr>
+        <w:t xml:space="preserve">.</w:t>
+      </w:r>
+    </w:p>
+    <w:p>
+      <w:pPr>
         <w:pStyle w:val="Heading2"/>
       </w:pPr>
       <w:bookmarkStart w:name="_Toc20" w:id="20"/>
@@ -3805,193 +3794,7 @@
         <w:rPr>
           <w:rFonts w:ascii="Arial" w:cs="Arial" w:eastAsia="Arial" w:hAnsi="Arial"/>
         </w:rPr>
-        <w:t xml:space="preserve">O portfólio e o repositório foram adicionados ao perfil do LinkedIn:</w:t>
-      </w:r>
-    </w:p>
-    <w:p>
-      <w:pPr>
-        <w:pStyle w:val="ListParagraph"/>
-        <w:numPr>
-          <w:ilvl w:val="0"/>
-          <w:numId w:val="3"/>
-        </w:numPr>
-        <w:spacing w:after="60" w:line="288"/>
-      </w:pPr>
-      <w:r>
-        <w:rPr>
-          <w:rFonts w:ascii="Arial" w:cs="Arial" w:eastAsia="Arial" w:hAnsi="Arial"/>
-        </w:rPr>
-        <w:t xml:space="preserve">No perfil, clicar em Adicionar seção, depois Recomendado e Adicionar projetos.</w:t>
-      </w:r>
-    </w:p>
-    <w:p>
-      <w:pPr>
-        <w:pStyle w:val="ListParagraph"/>
-        <w:numPr>
-          <w:ilvl w:val="0"/>
-          <w:numId w:val="3"/>
-        </w:numPr>
-        <w:spacing w:after="60" w:line="288"/>
-      </w:pPr>
-      <w:r>
-        <w:rPr>
-          <w:rFonts w:ascii="Arial" w:cs="Arial" w:eastAsia="Arial" w:hAnsi="Arial"/>
-        </w:rPr>
-        <w:t xml:space="preserve">Nome: Study Hub e Portfólio. Associar ao curso de Ciências da Computação.</w:t>
-      </w:r>
-    </w:p>
-    <w:p>
-      <w:pPr>
-        <w:pStyle w:val="ListParagraph"/>
-        <w:numPr>
-          <w:ilvl w:val="0"/>
-          <w:numId w:val="3"/>
-        </w:numPr>
-        <w:spacing w:after="60" w:line="288"/>
-      </w:pPr>
-      <w:r>
-        <w:rPr>
-          <w:rFonts w:ascii="Arial" w:cs="Arial" w:eastAsia="Arial" w:hAnsi="Arial"/>
-        </w:rPr>
-        <w:t xml:space="preserve">Em Mídia, adicionar os links do GitHub Pages e do repositório.</w:t>
-      </w:r>
-    </w:p>
-    <w:p>
-      <w:pPr>
-        <w:pStyle w:val="ListParagraph"/>
-        <w:numPr>
-          <w:ilvl w:val="0"/>
-          <w:numId w:val="3"/>
-        </w:numPr>
-        <w:spacing w:after="60" w:line="288"/>
-      </w:pPr>
-      <w:r>
-        <w:rPr>
-          <w:rFonts w:ascii="Arial" w:cs="Arial" w:eastAsia="Arial" w:hAnsi="Arial"/>
-        </w:rPr>
-        <w:t xml:space="preserve">Em Destaques, adicionar o link do portfólio para que ele apareça no topo do perfil.</w:t>
-      </w:r>
-    </w:p>
-    <w:p>
-      <w:pPr>
-        <w:pStyle w:val="ListParagraph"/>
-        <w:numPr>
-          <w:ilvl w:val="0"/>
-          <w:numId w:val="3"/>
-        </w:numPr>
-        <w:spacing w:after="60" w:line="288"/>
-      </w:pPr>
-      <w:r>
-        <w:rPr>
-          <w:rFonts w:ascii="Arial" w:cs="Arial" w:eastAsia="Arial" w:hAnsi="Arial"/>
-        </w:rPr>
-        <w:t xml:space="preserve">Na seção Contato, adicionar o site do portfólio.</w:t>
-      </w:r>
-    </w:p>
-    <w:p>
-      <w:pPr>
-        <w:spacing w:after="120" w:line="300"/>
-      </w:pPr>
-      <w:r>
-        <w:rPr>
-          <w:rFonts w:ascii="Arial" w:cs="Arial" w:eastAsia="Arial" w:hAnsi="Arial"/>
-        </w:rPr>
-        <w:t xml:space="preserve">Descrição usada no projeto do LinkedIn:</w:t>
-      </w:r>
-    </w:p>
-    <w:p>
-      <w:pPr>
-        <w:shd w:fill="F3F1FB" w:color="auto" w:val="clear"/>
-        <w:spacing w:after="0" w:line="260"/>
-        <w:ind w:left="200" w:right="200"/>
-      </w:pPr>
-      <w:r>
-        <w:rPr>
-          <w:rFonts w:ascii="Consolas" w:cs="Consolas" w:eastAsia="Consolas" w:hAnsi="Consolas"/>
-          <w:sz w:val="18"/>
-          <w:szCs w:val="18"/>
-        </w:rPr>
-        <w:t xml:space="preserve">Repositório público e versionado com Git que reúne meus projetos</w:t>
-      </w:r>
-    </w:p>
-    <w:p>
-      <w:pPr>
-        <w:shd w:fill="F3F1FB" w:color="auto" w:val="clear"/>
-        <w:spacing w:after="0" w:line="260"/>
-        <w:ind w:left="200" w:right="200"/>
-      </w:pPr>
-      <w:r>
-        <w:rPr>
-          <w:rFonts w:ascii="Consolas" w:cs="Consolas" w:eastAsia="Consolas" w:hAnsi="Consolas"/>
-          <w:sz w:val="18"/>
-          <w:szCs w:val="18"/>
-        </w:rPr>
-        <w:t xml:space="preserve">acadêmicos e pessoais, com um portfólio publicado no GitHub Pages</w:t>
-      </w:r>
-    </w:p>
-    <w:p>
-      <w:pPr>
-        <w:shd w:fill="F3F1FB" w:color="auto" w:val="clear"/>
-        <w:spacing w:after="0" w:line="260"/>
-        <w:ind w:left="200" w:right="200"/>
-      </w:pPr>
-      <w:r>
-        <w:rPr>
-          <w:rFonts w:ascii="Consolas" w:cs="Consolas" w:eastAsia="Consolas" w:hAnsi="Consolas"/>
-          <w:sz w:val="18"/>
-          <w:szCs w:val="18"/>
-        </w:rPr>
-        <w:t xml:space="preserve">(HTML, CSS e JavaScript). Uso branches, Conventional Commits e tags</w:t>
-      </w:r>
-    </w:p>
-    <w:p>
-      <w:pPr>
-        <w:shd w:fill="F3F1FB" w:color="auto" w:val="clear"/>
-        <w:spacing w:after="160" w:line="260"/>
-        <w:ind w:left="200" w:right="200"/>
-      </w:pPr>
-      <w:r>
-        <w:rPr>
-          <w:rFonts w:ascii="Consolas" w:cs="Consolas" w:eastAsia="Consolas" w:hAnsi="Consolas"/>
-          <w:sz w:val="18"/>
-          <w:szCs w:val="18"/>
-        </w:rPr>
-        <w:t xml:space="preserve">de versão, e cada projeto é documentado com README.</w:t>
-      </w:r>
-    </w:p>
-    <w:p>
-      <w:pPr>
-        <w:spacing w:after="120" w:line="300"/>
-      </w:pPr>
-      <w:r>
-        <w:rPr>
-          <w:rFonts w:ascii="Arial" w:cs="Arial" w:eastAsia="Arial" w:hAnsi="Arial"/>
-        </w:rPr>
-        <w:t xml:space="preserve">No sentido inverso, o site e os READMEs têm links para o LinkedIn (menu, seção de contato e rodapé).</w:t>
-      </w:r>
-    </w:p>
-    <w:p>
-      <w:pPr>
-        <w:pStyle w:val="Heading1"/>
-      </w:pPr>
-      <w:bookmarkStart w:name="_Toc21" w:id="21"/>
-      <w:r>
-        <w:rPr>
-          <w:rFonts w:ascii="Arial" w:cs="Arial" w:eastAsia="Arial" w:hAnsi="Arial"/>
-        </w:rPr>
-        <w:t xml:space="preserve">6. Revisão Final e Apresentação</w:t>
-      </w:r>
-      <w:bookmarkEnd w:id="21"/>
-    </w:p>
-    <w:p>
-      <w:pPr>
-        <w:spacing w:after="120" w:line="300"/>
-      </w:pPr>
-      <w:r>
-        <w:rPr>
-          <w:rFonts w:ascii="Arial" w:cs="Arial" w:eastAsia="Arial" w:hAnsi="Arial"/>
-        </w:rPr>
-        <w:t xml:space="preserve">A apresentação é um vídeo de 5 minutos no YouTube, em formato horizontal, mostrando o repositório e a página publicada.</w:t>
+        <w:t xml:space="preserve">A integração foi feita a partir do repositório e do site, que direcionam o visitante para o perfil profissional no LinkedIn:</w:t>
       </w:r>
     </w:p>
     <w:tbl>
@@ -4007,8 +3810,8 @@
         </w:tblBorders>
       </w:tblPr>
       <w:tblGrid>
-        <w:gridCol w:w="1800"/>
-        <w:gridCol w:w="7226"/>
+        <w:gridCol w:w="3200"/>
+        <w:gridCol w:w="5826"/>
       </w:tblGrid>
       <w:tr>
         <w:trPr>
@@ -4016,7 +3819,7 @@
         </w:trPr>
         <w:tc>
           <w:tcPr>
-            <w:tcW w:type="dxa" w:w="1800"/>
+            <w:tcW w:type="dxa" w:w="3200"/>
             <w:tcBorders>
               <w:top w:val="single" w:color="D0CCE6" w:sz="4"/>
               <w:left w:val="single" w:color="D0CCE6" w:sz="4"/>
@@ -4040,13 +3843,13 @@
                 <w:sz w:val="20"/>
                 <w:szCs w:val="20"/>
               </w:rPr>
-              <w:t xml:space="preserve">Tempo</w:t>
-            </w:r>
-          </w:p>
-        </w:tc>
-        <w:tc>
-          <w:tcPr>
-            <w:tcW w:type="dxa" w:w="7226"/>
+              <w:t xml:space="preserve">Local</w:t>
+            </w:r>
+          </w:p>
+        </w:tc>
+        <w:tc>
+          <w:tcPr>
+            <w:tcW w:type="dxa" w:w="5826"/>
             <w:tcBorders>
               <w:top w:val="single" w:color="D0CCE6" w:sz="4"/>
               <w:left w:val="single" w:color="D0CCE6" w:sz="4"/>
@@ -4070,7 +3873,7 @@
                 <w:sz w:val="20"/>
                 <w:szCs w:val="20"/>
               </w:rPr>
-              <w:t xml:space="preserve">Conteúdo</w:t>
+              <w:t xml:space="preserve">Link para o LinkedIn</w:t>
             </w:r>
           </w:p>
         </w:tc>
@@ -4078,59 +3881,59 @@
       <w:tr>
         <w:tc>
           <w:tcPr>
-            <w:tcW w:type="dxa" w:w="1800"/>
-            <w:tcBorders>
-              <w:top w:val="single" w:color="D0CCE6" w:sz="4"/>
-              <w:left w:val="single" w:color="D0CCE6" w:sz="4"/>
-              <w:bottom w:val="single" w:color="D0CCE6" w:sz="4"/>
-              <w:right w:val="single" w:color="D0CCE6" w:sz="4"/>
-            </w:tcBorders>
-            <w:tcMar>
-              <w:top w:type="dxa" w:w="80"/>
-              <w:left w:type="dxa" w:w="120"/>
-              <w:bottom w:type="dxa" w:w="80"/>
-              <w:right w:type="dxa" w:w="120"/>
-            </w:tcMar>
-          </w:tcPr>
-          <w:p>
-            <w:r>
-              <w:rPr>
-                <w:rFonts w:ascii="Arial" w:cs="Arial" w:eastAsia="Arial" w:hAnsi="Arial"/>
-                <w:b w:val="false"/>
-                <w:bCs w:val="false"/>
-                <w:sz w:val="20"/>
-                <w:szCs w:val="20"/>
-              </w:rPr>
-              <w:t xml:space="preserve">0:00 – 0:30</w:t>
-            </w:r>
-          </w:p>
-        </w:tc>
-        <w:tc>
-          <w:tcPr>
-            <w:tcW w:type="dxa" w:w="7226"/>
-            <w:tcBorders>
-              <w:top w:val="single" w:color="D0CCE6" w:sz="4"/>
-              <w:left w:val="single" w:color="D0CCE6" w:sz="4"/>
-              <w:bottom w:val="single" w:color="D0CCE6" w:sz="4"/>
-              <w:right w:val="single" w:color="D0CCE6" w:sz="4"/>
-            </w:tcBorders>
-            <w:tcMar>
-              <w:top w:type="dxa" w:w="80"/>
-              <w:left w:type="dxa" w:w="120"/>
-              <w:bottom w:type="dxa" w:w="80"/>
-              <w:right w:type="dxa" w:w="120"/>
-            </w:tcMar>
-          </w:tcPr>
-          <w:p>
-            <w:r>
-              <w:rPr>
-                <w:rFonts w:ascii="Arial" w:cs="Arial" w:eastAsia="Arial" w:hAnsi="Arial"/>
-                <w:b w:val="false"/>
-                <w:bCs w:val="false"/>
-                <w:sz w:val="20"/>
-                <w:szCs w:val="20"/>
-              </w:rPr>
-              <w:t xml:space="preserve">Abertura: quem sou e o que será apresentado.</w:t>
+            <w:tcW w:type="dxa" w:w="3200"/>
+            <w:tcBorders>
+              <w:top w:val="single" w:color="D0CCE6" w:sz="4"/>
+              <w:left w:val="single" w:color="D0CCE6" w:sz="4"/>
+              <w:bottom w:val="single" w:color="D0CCE6" w:sz="4"/>
+              <w:right w:val="single" w:color="D0CCE6" w:sz="4"/>
+            </w:tcBorders>
+            <w:tcMar>
+              <w:top w:type="dxa" w:w="80"/>
+              <w:left w:type="dxa" w:w="120"/>
+              <w:bottom w:type="dxa" w:w="80"/>
+              <w:right w:type="dxa" w:w="120"/>
+            </w:tcMar>
+          </w:tcPr>
+          <w:p>
+            <w:r>
+              <w:rPr>
+                <w:rFonts w:ascii="Arial" w:cs="Arial" w:eastAsia="Arial" w:hAnsi="Arial"/>
+                <w:b w:val="false"/>
+                <w:bCs w:val="false"/>
+                <w:sz w:val="20"/>
+                <w:szCs w:val="20"/>
+              </w:rPr>
+              <w:t xml:space="preserve">Site: menu do topo</w:t>
+            </w:r>
+          </w:p>
+        </w:tc>
+        <w:tc>
+          <w:tcPr>
+            <w:tcW w:type="dxa" w:w="5826"/>
+            <w:tcBorders>
+              <w:top w:val="single" w:color="D0CCE6" w:sz="4"/>
+              <w:left w:val="single" w:color="D0CCE6" w:sz="4"/>
+              <w:bottom w:val="single" w:color="D0CCE6" w:sz="4"/>
+              <w:right w:val="single" w:color="D0CCE6" w:sz="4"/>
+            </w:tcBorders>
+            <w:tcMar>
+              <w:top w:type="dxa" w:w="80"/>
+              <w:left w:type="dxa" w:w="120"/>
+              <w:bottom w:type="dxa" w:w="80"/>
+              <w:right w:type="dxa" w:w="120"/>
+            </w:tcMar>
+          </w:tcPr>
+          <w:p>
+            <w:r>
+              <w:rPr>
+                <w:rFonts w:ascii="Arial" w:cs="Arial" w:eastAsia="Arial" w:hAnsi="Arial"/>
+                <w:b w:val="false"/>
+                <w:bCs w:val="false"/>
+                <w:sz w:val="20"/>
+                <w:szCs w:val="20"/>
+              </w:rPr>
+              <w:t xml:space="preserve">Item "LinkedIn", visível em todas as seções.</w:t>
             </w:r>
           </w:p>
         </w:tc>
@@ -4138,59 +3941,59 @@
       <w:tr>
         <w:tc>
           <w:tcPr>
-            <w:tcW w:type="dxa" w:w="1800"/>
-            <w:tcBorders>
-              <w:top w:val="single" w:color="D0CCE6" w:sz="4"/>
-              <w:left w:val="single" w:color="D0CCE6" w:sz="4"/>
-              <w:bottom w:val="single" w:color="D0CCE6" w:sz="4"/>
-              <w:right w:val="single" w:color="D0CCE6" w:sz="4"/>
-            </w:tcBorders>
-            <w:tcMar>
-              <w:top w:type="dxa" w:w="80"/>
-              <w:left w:type="dxa" w:w="120"/>
-              <w:bottom w:type="dxa" w:w="80"/>
-              <w:right w:type="dxa" w:w="120"/>
-            </w:tcMar>
-          </w:tcPr>
-          <w:p>
-            <w:r>
-              <w:rPr>
-                <w:rFonts w:ascii="Arial" w:cs="Arial" w:eastAsia="Arial" w:hAnsi="Arial"/>
-                <w:b w:val="false"/>
-                <w:bCs w:val="false"/>
-                <w:sz w:val="20"/>
-                <w:szCs w:val="20"/>
-              </w:rPr>
-              <w:t xml:space="preserve">0:30 – 1:30</w:t>
-            </w:r>
-          </w:p>
-        </w:tc>
-        <w:tc>
-          <w:tcPr>
-            <w:tcW w:type="dxa" w:w="7226"/>
-            <w:tcBorders>
-              <w:top w:val="single" w:color="D0CCE6" w:sz="4"/>
-              <w:left w:val="single" w:color="D0CCE6" w:sz="4"/>
-              <w:bottom w:val="single" w:color="D0CCE6" w:sz="4"/>
-              <w:right w:val="single" w:color="D0CCE6" w:sz="4"/>
-            </w:tcBorders>
-            <w:tcMar>
-              <w:top w:type="dxa" w:w="80"/>
-              <w:left w:type="dxa" w:w="120"/>
-              <w:bottom w:type="dxa" w:w="80"/>
-              <w:right w:type="dxa" w:w="120"/>
-            </w:tcMar>
-          </w:tcPr>
-          <w:p>
-            <w:r>
-              <w:rPr>
-                <w:rFonts w:ascii="Arial" w:cs="Arial" w:eastAsia="Arial" w:hAnsi="Arial"/>
-                <w:b w:val="false"/>
-                <w:bCs w:val="false"/>
-                <w:sz w:val="20"/>
-                <w:szCs w:val="20"/>
-              </w:rPr>
-              <w:t xml:space="preserve">Planejamento: as seções e a estrutura de pastas do repositório.</w:t>
+            <w:tcW w:type="dxa" w:w="3200"/>
+            <w:tcBorders>
+              <w:top w:val="single" w:color="D0CCE6" w:sz="4"/>
+              <w:left w:val="single" w:color="D0CCE6" w:sz="4"/>
+              <w:bottom w:val="single" w:color="D0CCE6" w:sz="4"/>
+              <w:right w:val="single" w:color="D0CCE6" w:sz="4"/>
+            </w:tcBorders>
+            <w:tcMar>
+              <w:top w:type="dxa" w:w="80"/>
+              <w:left w:type="dxa" w:w="120"/>
+              <w:bottom w:type="dxa" w:w="80"/>
+              <w:right w:type="dxa" w:w="120"/>
+            </w:tcMar>
+          </w:tcPr>
+          <w:p>
+            <w:r>
+              <w:rPr>
+                <w:rFonts w:ascii="Arial" w:cs="Arial" w:eastAsia="Arial" w:hAnsi="Arial"/>
+                <w:b w:val="false"/>
+                <w:bCs w:val="false"/>
+                <w:sz w:val="20"/>
+                <w:szCs w:val="20"/>
+              </w:rPr>
+              <w:t xml:space="preserve">Site: seção Contato</w:t>
+            </w:r>
+          </w:p>
+        </w:tc>
+        <w:tc>
+          <w:tcPr>
+            <w:tcW w:type="dxa" w:w="5826"/>
+            <w:tcBorders>
+              <w:top w:val="single" w:color="D0CCE6" w:sz="4"/>
+              <w:left w:val="single" w:color="D0CCE6" w:sz="4"/>
+              <w:bottom w:val="single" w:color="D0CCE6" w:sz="4"/>
+              <w:right w:val="single" w:color="D0CCE6" w:sz="4"/>
+            </w:tcBorders>
+            <w:tcMar>
+              <w:top w:type="dxa" w:w="80"/>
+              <w:left w:type="dxa" w:w="120"/>
+              <w:bottom w:type="dxa" w:w="80"/>
+              <w:right w:type="dxa" w:w="120"/>
+            </w:tcMar>
+          </w:tcPr>
+          <w:p>
+            <w:r>
+              <w:rPr>
+                <w:rFonts w:ascii="Arial" w:cs="Arial" w:eastAsia="Arial" w:hAnsi="Arial"/>
+                <w:b w:val="false"/>
+                <w:bCs w:val="false"/>
+                <w:sz w:val="20"/>
+                <w:szCs w:val="20"/>
+              </w:rPr>
+              <w:t xml:space="preserve">Botão "LinkedIn", ao lado do e-mail e do GitHub.</w:t>
             </w:r>
           </w:p>
         </w:tc>
@@ -4198,59 +4001,59 @@
       <w:tr>
         <w:tc>
           <w:tcPr>
-            <w:tcW w:type="dxa" w:w="1800"/>
-            <w:tcBorders>
-              <w:top w:val="single" w:color="D0CCE6" w:sz="4"/>
-              <w:left w:val="single" w:color="D0CCE6" w:sz="4"/>
-              <w:bottom w:val="single" w:color="D0CCE6" w:sz="4"/>
-              <w:right w:val="single" w:color="D0CCE6" w:sz="4"/>
-            </w:tcBorders>
-            <w:tcMar>
-              <w:top w:type="dxa" w:w="80"/>
-              <w:left w:type="dxa" w:w="120"/>
-              <w:bottom w:type="dxa" w:w="80"/>
-              <w:right w:type="dxa" w:w="120"/>
-            </w:tcMar>
-          </w:tcPr>
-          <w:p>
-            <w:r>
-              <w:rPr>
-                <w:rFonts w:ascii="Arial" w:cs="Arial" w:eastAsia="Arial" w:hAnsi="Arial"/>
-                <w:b w:val="false"/>
-                <w:bCs w:val="false"/>
-                <w:sz w:val="20"/>
-                <w:szCs w:val="20"/>
-              </w:rPr>
-              <w:t xml:space="preserve">1:30 – 2:30</w:t>
-            </w:r>
-          </w:p>
-        </w:tc>
-        <w:tc>
-          <w:tcPr>
-            <w:tcW w:type="dxa" w:w="7226"/>
-            <w:tcBorders>
-              <w:top w:val="single" w:color="D0CCE6" w:sz="4"/>
-              <w:left w:val="single" w:color="D0CCE6" w:sz="4"/>
-              <w:bottom w:val="single" w:color="D0CCE6" w:sz="4"/>
-              <w:right w:val="single" w:color="D0CCE6" w:sz="4"/>
-            </w:tcBorders>
-            <w:tcMar>
-              <w:top w:type="dxa" w:w="80"/>
-              <w:left w:type="dxa" w:w="120"/>
-              <w:bottom w:type="dxa" w:w="80"/>
-              <w:right w:type="dxa" w:w="120"/>
-            </w:tcMar>
-          </w:tcPr>
-          <w:p>
-            <w:r>
-              <w:rPr>
-                <w:rFonts w:ascii="Arial" w:cs="Arial" w:eastAsia="Arial" w:hAnsi="Arial"/>
-                <w:b w:val="false"/>
-                <w:bCs w:val="false"/>
-                <w:sz w:val="20"/>
-                <w:szCs w:val="20"/>
-              </w:rPr>
-              <w:t xml:space="preserve">Versionamento: branches, commits, merge e as tags v1.0 e v1.1 no GitHub.</w:t>
+            <w:tcW w:type="dxa" w:w="3200"/>
+            <w:tcBorders>
+              <w:top w:val="single" w:color="D0CCE6" w:sz="4"/>
+              <w:left w:val="single" w:color="D0CCE6" w:sz="4"/>
+              <w:bottom w:val="single" w:color="D0CCE6" w:sz="4"/>
+              <w:right w:val="single" w:color="D0CCE6" w:sz="4"/>
+            </w:tcBorders>
+            <w:tcMar>
+              <w:top w:type="dxa" w:w="80"/>
+              <w:left w:type="dxa" w:w="120"/>
+              <w:bottom w:type="dxa" w:w="80"/>
+              <w:right w:type="dxa" w:w="120"/>
+            </w:tcMar>
+          </w:tcPr>
+          <w:p>
+            <w:r>
+              <w:rPr>
+                <w:rFonts w:ascii="Arial" w:cs="Arial" w:eastAsia="Arial" w:hAnsi="Arial"/>
+                <w:b w:val="false"/>
+                <w:bCs w:val="false"/>
+                <w:sz w:val="20"/>
+                <w:szCs w:val="20"/>
+              </w:rPr>
+              <w:t xml:space="preserve">Site: rodapé</w:t>
+            </w:r>
+          </w:p>
+        </w:tc>
+        <w:tc>
+          <w:tcPr>
+            <w:tcW w:type="dxa" w:w="5826"/>
+            <w:tcBorders>
+              <w:top w:val="single" w:color="D0CCE6" w:sz="4"/>
+              <w:left w:val="single" w:color="D0CCE6" w:sz="4"/>
+              <w:bottom w:val="single" w:color="D0CCE6" w:sz="4"/>
+              <w:right w:val="single" w:color="D0CCE6" w:sz="4"/>
+            </w:tcBorders>
+            <w:tcMar>
+              <w:top w:type="dxa" w:w="80"/>
+              <w:left w:type="dxa" w:w="120"/>
+              <w:bottom w:type="dxa" w:w="80"/>
+              <w:right w:type="dxa" w:w="120"/>
+            </w:tcMar>
+          </w:tcPr>
+          <w:p>
+            <w:r>
+              <w:rPr>
+                <w:rFonts w:ascii="Arial" w:cs="Arial" w:eastAsia="Arial" w:hAnsi="Arial"/>
+                <w:b w:val="false"/>
+                <w:bCs w:val="false"/>
+                <w:sz w:val="20"/>
+                <w:szCs w:val="20"/>
+              </w:rPr>
+              <w:t xml:space="preserve">Link junto ao status profissional.</w:t>
             </w:r>
           </w:p>
         </w:tc>
@@ -4258,59 +4061,59 @@
       <w:tr>
         <w:tc>
           <w:tcPr>
-            <w:tcW w:type="dxa" w:w="1800"/>
-            <w:tcBorders>
-              <w:top w:val="single" w:color="D0CCE6" w:sz="4"/>
-              <w:left w:val="single" w:color="D0CCE6" w:sz="4"/>
-              <w:bottom w:val="single" w:color="D0CCE6" w:sz="4"/>
-              <w:right w:val="single" w:color="D0CCE6" w:sz="4"/>
-            </w:tcBorders>
-            <w:tcMar>
-              <w:top w:type="dxa" w:w="80"/>
-              <w:left w:type="dxa" w:w="120"/>
-              <w:bottom w:type="dxa" w:w="80"/>
-              <w:right w:type="dxa" w:w="120"/>
-            </w:tcMar>
-          </w:tcPr>
-          <w:p>
-            <w:r>
-              <w:rPr>
-                <w:rFonts w:ascii="Arial" w:cs="Arial" w:eastAsia="Arial" w:hAnsi="Arial"/>
-                <w:b w:val="false"/>
-                <w:bCs w:val="false"/>
-                <w:sz w:val="20"/>
-                <w:szCs w:val="20"/>
-              </w:rPr>
-              <w:t xml:space="preserve">2:30 – 3:30</w:t>
-            </w:r>
-          </w:p>
-        </w:tc>
-        <w:tc>
-          <w:tcPr>
-            <w:tcW w:type="dxa" w:w="7226"/>
-            <w:tcBorders>
-              <w:top w:val="single" w:color="D0CCE6" w:sz="4"/>
-              <w:left w:val="single" w:color="D0CCE6" w:sz="4"/>
-              <w:bottom w:val="single" w:color="D0CCE6" w:sz="4"/>
-              <w:right w:val="single" w:color="D0CCE6" w:sz="4"/>
-            </w:tcBorders>
-            <w:tcMar>
-              <w:top w:type="dxa" w:w="80"/>
-              <w:left w:type="dxa" w:w="120"/>
-              <w:bottom w:type="dxa" w:w="80"/>
-              <w:right w:type="dxa" w:w="120"/>
-            </w:tcMar>
-          </w:tcPr>
-          <w:p>
-            <w:r>
-              <w:rPr>
-                <w:rFonts w:ascii="Arial" w:cs="Arial" w:eastAsia="Arial" w:hAnsi="Arial"/>
-                <w:b w:val="false"/>
-                <w:bCs w:val="false"/>
-                <w:sz w:val="20"/>
-                <w:szCs w:val="20"/>
-              </w:rPr>
-              <w:t xml:space="preserve">Documentação: README principal e READMEs dos projetos.</w:t>
+            <w:tcW w:type="dxa" w:w="3200"/>
+            <w:tcBorders>
+              <w:top w:val="single" w:color="D0CCE6" w:sz="4"/>
+              <w:left w:val="single" w:color="D0CCE6" w:sz="4"/>
+              <w:bottom w:val="single" w:color="D0CCE6" w:sz="4"/>
+              <w:right w:val="single" w:color="D0CCE6" w:sz="4"/>
+            </w:tcBorders>
+            <w:tcMar>
+              <w:top w:type="dxa" w:w="80"/>
+              <w:left w:type="dxa" w:w="120"/>
+              <w:bottom w:type="dxa" w:w="80"/>
+              <w:right w:type="dxa" w:w="120"/>
+            </w:tcMar>
+          </w:tcPr>
+          <w:p>
+            <w:r>
+              <w:rPr>
+                <w:rFonts w:ascii="Arial" w:cs="Arial" w:eastAsia="Arial" w:hAnsi="Arial"/>
+                <w:b w:val="false"/>
+                <w:bCs w:val="false"/>
+                <w:sz w:val="20"/>
+                <w:szCs w:val="20"/>
+              </w:rPr>
+              <w:t xml:space="preserve">README principal</w:t>
+            </w:r>
+          </w:p>
+        </w:tc>
+        <w:tc>
+          <w:tcPr>
+            <w:tcW w:type="dxa" w:w="5826"/>
+            <w:tcBorders>
+              <w:top w:val="single" w:color="D0CCE6" w:sz="4"/>
+              <w:left w:val="single" w:color="D0CCE6" w:sz="4"/>
+              <w:bottom w:val="single" w:color="D0CCE6" w:sz="4"/>
+              <w:right w:val="single" w:color="D0CCE6" w:sz="4"/>
+            </w:tcBorders>
+            <w:tcMar>
+              <w:top w:type="dxa" w:w="80"/>
+              <w:left w:type="dxa" w:w="120"/>
+              <w:bottom w:type="dxa" w:w="80"/>
+              <w:right w:type="dxa" w:w="120"/>
+            </w:tcMar>
+          </w:tcPr>
+          <w:p>
+            <w:r>
+              <w:rPr>
+                <w:rFonts w:ascii="Arial" w:cs="Arial" w:eastAsia="Arial" w:hAnsi="Arial"/>
+                <w:b w:val="false"/>
+                <w:bCs w:val="false"/>
+                <w:sz w:val="20"/>
+                <w:szCs w:val="20"/>
+              </w:rPr>
+              <w:t xml:space="preserve">Seção Contato.</w:t>
             </w:r>
           </w:p>
         </w:tc>
@@ -4318,59 +4121,59 @@
       <w:tr>
         <w:tc>
           <w:tcPr>
-            <w:tcW w:type="dxa" w:w="1800"/>
-            <w:tcBorders>
-              <w:top w:val="single" w:color="D0CCE6" w:sz="4"/>
-              <w:left w:val="single" w:color="D0CCE6" w:sz="4"/>
-              <w:bottom w:val="single" w:color="D0CCE6" w:sz="4"/>
-              <w:right w:val="single" w:color="D0CCE6" w:sz="4"/>
-            </w:tcBorders>
-            <w:tcMar>
-              <w:top w:type="dxa" w:w="80"/>
-              <w:left w:type="dxa" w:w="120"/>
-              <w:bottom w:type="dxa" w:w="80"/>
-              <w:right w:type="dxa" w:w="120"/>
-            </w:tcMar>
-          </w:tcPr>
-          <w:p>
-            <w:r>
-              <w:rPr>
-                <w:rFonts w:ascii="Arial" w:cs="Arial" w:eastAsia="Arial" w:hAnsi="Arial"/>
-                <w:b w:val="false"/>
-                <w:bCs w:val="false"/>
-                <w:sz w:val="20"/>
-                <w:szCs w:val="20"/>
-              </w:rPr>
-              <w:t xml:space="preserve">3:30 – 4:30</w:t>
-            </w:r>
-          </w:p>
-        </w:tc>
-        <w:tc>
-          <w:tcPr>
-            <w:tcW w:type="dxa" w:w="7226"/>
-            <w:tcBorders>
-              <w:top w:val="single" w:color="D0CCE6" w:sz="4"/>
-              <w:left w:val="single" w:color="D0CCE6" w:sz="4"/>
-              <w:bottom w:val="single" w:color="D0CCE6" w:sz="4"/>
-              <w:right w:val="single" w:color="D0CCE6" w:sz="4"/>
-            </w:tcBorders>
-            <w:tcMar>
-              <w:top w:type="dxa" w:w="80"/>
-              <w:left w:type="dxa" w:w="120"/>
-              <w:bottom w:type="dxa" w:w="80"/>
-              <w:right w:type="dxa" w:w="120"/>
-            </w:tcMar>
-          </w:tcPr>
-          <w:p>
-            <w:r>
-              <w:rPr>
-                <w:rFonts w:ascii="Arial" w:cs="Arial" w:eastAsia="Arial" w:hAnsi="Arial"/>
-                <w:b w:val="false"/>
-                <w:bCs w:val="false"/>
-                <w:sz w:val="20"/>
-                <w:szCs w:val="20"/>
-              </w:rPr>
-              <w:t xml:space="preserve">GitHub Pages: navegação pelo portfólio no computador e no celular.</w:t>
+            <w:tcW w:type="dxa" w:w="3200"/>
+            <w:tcBorders>
+              <w:top w:val="single" w:color="D0CCE6" w:sz="4"/>
+              <w:left w:val="single" w:color="D0CCE6" w:sz="4"/>
+              <w:bottom w:val="single" w:color="D0CCE6" w:sz="4"/>
+              <w:right w:val="single" w:color="D0CCE6" w:sz="4"/>
+            </w:tcBorders>
+            <w:tcMar>
+              <w:top w:type="dxa" w:w="80"/>
+              <w:left w:type="dxa" w:w="120"/>
+              <w:bottom w:type="dxa" w:w="80"/>
+              <w:right w:type="dxa" w:w="120"/>
+            </w:tcMar>
+          </w:tcPr>
+          <w:p>
+            <w:r>
+              <w:rPr>
+                <w:rFonts w:ascii="Arial" w:cs="Arial" w:eastAsia="Arial" w:hAnsi="Arial"/>
+                <w:b w:val="false"/>
+                <w:bCs w:val="false"/>
+                <w:sz w:val="20"/>
+                <w:szCs w:val="20"/>
+              </w:rPr>
+              <w:t xml:space="preserve">README de apresentação e perfil</w:t>
+            </w:r>
+          </w:p>
+        </w:tc>
+        <w:tc>
+          <w:tcPr>
+            <w:tcW w:type="dxa" w:w="5826"/>
+            <w:tcBorders>
+              <w:top w:val="single" w:color="D0CCE6" w:sz="4"/>
+              <w:left w:val="single" w:color="D0CCE6" w:sz="4"/>
+              <w:bottom w:val="single" w:color="D0CCE6" w:sz="4"/>
+              <w:right w:val="single" w:color="D0CCE6" w:sz="4"/>
+            </w:tcBorders>
+            <w:tcMar>
+              <w:top w:type="dxa" w:w="80"/>
+              <w:left w:type="dxa" w:w="120"/>
+              <w:bottom w:type="dxa" w:w="80"/>
+              <w:right w:type="dxa" w:w="120"/>
+            </w:tcMar>
+          </w:tcPr>
+          <w:p>
+            <w:r>
+              <w:rPr>
+                <w:rFonts w:ascii="Arial" w:cs="Arial" w:eastAsia="Arial" w:hAnsi="Arial"/>
+                <w:b w:val="false"/>
+                <w:bCs w:val="false"/>
+                <w:sz w:val="20"/>
+                <w:szCs w:val="20"/>
+              </w:rPr>
+              <w:t xml:space="preserve">Seção Contato.</w:t>
             </w:r>
           </w:p>
         </w:tc>
@@ -4378,59 +4181,59 @@
       <w:tr>
         <w:tc>
           <w:tcPr>
-            <w:tcW w:type="dxa" w:w="1800"/>
-            <w:tcBorders>
-              <w:top w:val="single" w:color="D0CCE6" w:sz="4"/>
-              <w:left w:val="single" w:color="D0CCE6" w:sz="4"/>
-              <w:bottom w:val="single" w:color="D0CCE6" w:sz="4"/>
-              <w:right w:val="single" w:color="D0CCE6" w:sz="4"/>
-            </w:tcBorders>
-            <w:tcMar>
-              <w:top w:type="dxa" w:w="80"/>
-              <w:left w:type="dxa" w:w="120"/>
-              <w:bottom w:type="dxa" w:w="80"/>
-              <w:right w:type="dxa" w:w="120"/>
-            </w:tcMar>
-          </w:tcPr>
-          <w:p>
-            <w:r>
-              <w:rPr>
-                <w:rFonts w:ascii="Arial" w:cs="Arial" w:eastAsia="Arial" w:hAnsi="Arial"/>
-                <w:b w:val="false"/>
-                <w:bCs w:val="false"/>
-                <w:sz w:val="20"/>
-                <w:szCs w:val="20"/>
-              </w:rPr>
-              <w:t xml:space="preserve">4:30 – 5:00</w:t>
-            </w:r>
-          </w:p>
-        </w:tc>
-        <w:tc>
-          <w:tcPr>
-            <w:tcW w:type="dxa" w:w="7226"/>
-            <w:tcBorders>
-              <w:top w:val="single" w:color="D0CCE6" w:sz="4"/>
-              <w:left w:val="single" w:color="D0CCE6" w:sz="4"/>
-              <w:bottom w:val="single" w:color="D0CCE6" w:sz="4"/>
-              <w:right w:val="single" w:color="D0CCE6" w:sz="4"/>
-            </w:tcBorders>
-            <w:tcMar>
-              <w:top w:type="dxa" w:w="80"/>
-              <w:left w:type="dxa" w:w="120"/>
-              <w:bottom w:type="dxa" w:w="80"/>
-              <w:right w:type="dxa" w:w="120"/>
-            </w:tcMar>
-          </w:tcPr>
-          <w:p>
-            <w:r>
-              <w:rPr>
-                <w:rFonts w:ascii="Arial" w:cs="Arial" w:eastAsia="Arial" w:hAnsi="Arial"/>
-                <w:b w:val="false"/>
-                <w:bCs w:val="false"/>
-                <w:sz w:val="20"/>
-                <w:szCs w:val="20"/>
-              </w:rPr>
-              <w:t xml:space="preserve">LinkedIn e encerramento.</w:t>
+            <w:tcW w:type="dxa" w:w="3200"/>
+            <w:tcBorders>
+              <w:top w:val="single" w:color="D0CCE6" w:sz="4"/>
+              <w:left w:val="single" w:color="D0CCE6" w:sz="4"/>
+              <w:bottom w:val="single" w:color="D0CCE6" w:sz="4"/>
+              <w:right w:val="single" w:color="D0CCE6" w:sz="4"/>
+            </w:tcBorders>
+            <w:tcMar>
+              <w:top w:type="dxa" w:w="80"/>
+              <w:left w:type="dxa" w:w="120"/>
+              <w:bottom w:type="dxa" w:w="80"/>
+              <w:right w:type="dxa" w:w="120"/>
+            </w:tcMar>
+          </w:tcPr>
+          <w:p>
+            <w:r>
+              <w:rPr>
+                <w:rFonts w:ascii="Arial" w:cs="Arial" w:eastAsia="Arial" w:hAnsi="Arial"/>
+                <w:b w:val="false"/>
+                <w:bCs w:val="false"/>
+                <w:sz w:val="20"/>
+                <w:szCs w:val="20"/>
+              </w:rPr>
+              <w:t xml:space="preserve">README do projeto Portfólio</w:t>
+            </w:r>
+          </w:p>
+        </w:tc>
+        <w:tc>
+          <w:tcPr>
+            <w:tcW w:type="dxa" w:w="5826"/>
+            <w:tcBorders>
+              <w:top w:val="single" w:color="D0CCE6" w:sz="4"/>
+              <w:left w:val="single" w:color="D0CCE6" w:sz="4"/>
+              <w:bottom w:val="single" w:color="D0CCE6" w:sz="4"/>
+              <w:right w:val="single" w:color="D0CCE6" w:sz="4"/>
+            </w:tcBorders>
+            <w:tcMar>
+              <w:top w:type="dxa" w:w="80"/>
+              <w:left w:type="dxa" w:w="120"/>
+              <w:bottom w:type="dxa" w:w="80"/>
+              <w:right w:type="dxa" w:w="120"/>
+            </w:tcMar>
+          </w:tcPr>
+          <w:p>
+            <w:r>
+              <w:rPr>
+                <w:rFonts w:ascii="Arial" w:cs="Arial" w:eastAsia="Arial" w:hAnsi="Arial"/>
+                <w:b w:val="false"/>
+                <w:bCs w:val="false"/>
+                <w:sz w:val="20"/>
+                <w:szCs w:val="20"/>
+              </w:rPr>
+              <w:t xml:space="preserve">Seção Autor.</w:t>
             </w:r>
           </w:p>
         </w:tc>
@@ -4449,30 +4252,827 @@
         <w:rPr>
           <w:rFonts w:ascii="Arial" w:cs="Arial" w:eastAsia="Arial" w:hAnsi="Arial"/>
         </w:rPr>
-        <w:t xml:space="preserve">Link do vídeo: </w:t>
-      </w:r>
-      <w:r>
-        <w:rPr>
-          <w:rFonts w:ascii="Arial" w:cs="Arial" w:eastAsia="Arial" w:hAnsi="Arial"/>
-          <w:i/>
-          <w:iCs/>
-          <w:color w:val="555555"/>
-        </w:rPr>
-        <w:t xml:space="preserve">[inserir o link do vídeo após a publicação]</w:t>
-      </w:r>
+        <w:t xml:space="preserve">Perfil: </w:t>
+      </w:r>
+      <w:hyperlink w:history="1" r:id="rId7ybgdvyffsxducurgx2hc">
+        <w:r>
+          <w:rPr>
+            <w:rFonts w:ascii="Arial" w:cs="Arial" w:eastAsia="Arial" w:hAnsi="Arial"/>
+            <w:color w:val="5B3FD6"/>
+            <w:u w:val="single"/>
+          </w:rPr>
+          <w:t xml:space="preserve">https://www.linkedin.com/in/matheus-luigi-a7bb22220/</w:t>
+        </w:r>
+      </w:hyperlink>
     </w:p>
     <w:p>
       <w:pPr>
         <w:pStyle w:val="Heading1"/>
       </w:pPr>
+      <w:bookmarkStart w:name="_Toc21" w:id="21"/>
+      <w:r>
+        <w:rPr>
+          <w:rFonts w:ascii="Arial" w:cs="Arial" w:eastAsia="Arial" w:hAnsi="Arial"/>
+        </w:rPr>
+        <w:t xml:space="preserve">6. Revisão Final</w:t>
+      </w:r>
+      <w:bookmarkEnd w:id="21"/>
+    </w:p>
+    <w:p>
+      <w:pPr>
+        <w:spacing w:after="120" w:line="300"/>
+      </w:pPr>
+      <w:r>
+        <w:rPr>
+          <w:rFonts w:ascii="Arial" w:cs="Arial" w:eastAsia="Arial" w:hAnsi="Arial"/>
+        </w:rPr>
+        <w:t xml:space="preserve">Antes da entrega, o repositório e o site foram revisados com o seguinte checklist:</w:t>
+      </w:r>
+    </w:p>
+    <w:tbl>
+      <w:tblPr>
+        <w:tblW w:type="dxa" w:w="9026"/>
+        <w:tblBorders>
+          <w:top w:val="single" w:color="auto" w:sz="4"/>
+          <w:left w:val="single" w:color="auto" w:sz="4"/>
+          <w:bottom w:val="single" w:color="auto" w:sz="4"/>
+          <w:right w:val="single" w:color="auto" w:sz="4"/>
+          <w:insideH w:val="single" w:color="auto" w:sz="4"/>
+          <w:insideV w:val="single" w:color="auto" w:sz="4"/>
+        </w:tblBorders>
+      </w:tblPr>
+      <w:tblGrid>
+        <w:gridCol w:w="5600"/>
+        <w:gridCol w:w="3426"/>
+      </w:tblGrid>
+      <w:tr>
+        <w:trPr>
+          <w:tblHeader/>
+        </w:trPr>
+        <w:tc>
+          <w:tcPr>
+            <w:tcW w:type="dxa" w:w="5600"/>
+            <w:tcBorders>
+              <w:top w:val="single" w:color="D0CCE6" w:sz="4"/>
+              <w:left w:val="single" w:color="D0CCE6" w:sz="4"/>
+              <w:bottom w:val="single" w:color="D0CCE6" w:sz="4"/>
+              <w:right w:val="single" w:color="D0CCE6" w:sz="4"/>
+            </w:tcBorders>
+            <w:shd w:fill="EAE5FF" w:color="auto" w:val="clear"/>
+            <w:tcMar>
+              <w:top w:type="dxa" w:w="80"/>
+              <w:left w:type="dxa" w:w="120"/>
+              <w:bottom w:type="dxa" w:w="80"/>
+              <w:right w:type="dxa" w:w="120"/>
+            </w:tcMar>
+          </w:tcPr>
+          <w:p>
+            <w:r>
+              <w:rPr>
+                <w:rFonts w:ascii="Arial" w:cs="Arial" w:eastAsia="Arial" w:hAnsi="Arial"/>
+                <w:b/>
+                <w:bCs/>
+                <w:sz w:val="20"/>
+                <w:szCs w:val="20"/>
+              </w:rPr>
+              <w:t xml:space="preserve">Item revisado</w:t>
+            </w:r>
+          </w:p>
+        </w:tc>
+        <w:tc>
+          <w:tcPr>
+            <w:tcW w:type="dxa" w:w="3426"/>
+            <w:tcBorders>
+              <w:top w:val="single" w:color="D0CCE6" w:sz="4"/>
+              <w:left w:val="single" w:color="D0CCE6" w:sz="4"/>
+              <w:bottom w:val="single" w:color="D0CCE6" w:sz="4"/>
+              <w:right w:val="single" w:color="D0CCE6" w:sz="4"/>
+            </w:tcBorders>
+            <w:shd w:fill="EAE5FF" w:color="auto" w:val="clear"/>
+            <w:tcMar>
+              <w:top w:type="dxa" w:w="80"/>
+              <w:left w:type="dxa" w:w="120"/>
+              <w:bottom w:type="dxa" w:w="80"/>
+              <w:right w:type="dxa" w:w="120"/>
+            </w:tcMar>
+          </w:tcPr>
+          <w:p>
+            <w:r>
+              <w:rPr>
+                <w:rFonts w:ascii="Arial" w:cs="Arial" w:eastAsia="Arial" w:hAnsi="Arial"/>
+                <w:b/>
+                <w:bCs/>
+                <w:sz w:val="20"/>
+                <w:szCs w:val="20"/>
+              </w:rPr>
+              <w:t xml:space="preserve">Resultado</w:t>
+            </w:r>
+          </w:p>
+        </w:tc>
+      </w:tr>
+      <w:tr>
+        <w:tc>
+          <w:tcPr>
+            <w:tcW w:type="dxa" w:w="5600"/>
+            <w:tcBorders>
+              <w:top w:val="single" w:color="D0CCE6" w:sz="4"/>
+              <w:left w:val="single" w:color="D0CCE6" w:sz="4"/>
+              <w:bottom w:val="single" w:color="D0CCE6" w:sz="4"/>
+              <w:right w:val="single" w:color="D0CCE6" w:sz="4"/>
+            </w:tcBorders>
+            <w:tcMar>
+              <w:top w:type="dxa" w:w="80"/>
+              <w:left w:type="dxa" w:w="120"/>
+              <w:bottom w:type="dxa" w:w="80"/>
+              <w:right w:type="dxa" w:w="120"/>
+            </w:tcMar>
+          </w:tcPr>
+          <w:p>
+            <w:r>
+              <w:rPr>
+                <w:rFonts w:ascii="Arial" w:cs="Arial" w:eastAsia="Arial" w:hAnsi="Arial"/>
+                <w:b w:val="false"/>
+                <w:bCs w:val="false"/>
+                <w:sz w:val="20"/>
+                <w:szCs w:val="20"/>
+              </w:rPr>
+              <w:t xml:space="preserve">Repositório público acessível sem login</w:t>
+            </w:r>
+          </w:p>
+        </w:tc>
+        <w:tc>
+          <w:tcPr>
+            <w:tcW w:type="dxa" w:w="3426"/>
+            <w:tcBorders>
+              <w:top w:val="single" w:color="D0CCE6" w:sz="4"/>
+              <w:left w:val="single" w:color="D0CCE6" w:sz="4"/>
+              <w:bottom w:val="single" w:color="D0CCE6" w:sz="4"/>
+              <w:right w:val="single" w:color="D0CCE6" w:sz="4"/>
+            </w:tcBorders>
+            <w:tcMar>
+              <w:top w:type="dxa" w:w="80"/>
+              <w:left w:type="dxa" w:w="120"/>
+              <w:bottom w:type="dxa" w:w="80"/>
+              <w:right w:type="dxa" w:w="120"/>
+            </w:tcMar>
+          </w:tcPr>
+          <w:p>
+            <w:r>
+              <w:rPr>
+                <w:rFonts w:ascii="Arial" w:cs="Arial" w:eastAsia="Arial" w:hAnsi="Arial"/>
+                <w:b w:val="false"/>
+                <w:bCs w:val="false"/>
+                <w:sz w:val="20"/>
+                <w:szCs w:val="20"/>
+              </w:rPr>
+              <w:t xml:space="preserve">OK</w:t>
+            </w:r>
+          </w:p>
+        </w:tc>
+      </w:tr>
+      <w:tr>
+        <w:tc>
+          <w:tcPr>
+            <w:tcW w:type="dxa" w:w="5600"/>
+            <w:tcBorders>
+              <w:top w:val="single" w:color="D0CCE6" w:sz="4"/>
+              <w:left w:val="single" w:color="D0CCE6" w:sz="4"/>
+              <w:bottom w:val="single" w:color="D0CCE6" w:sz="4"/>
+              <w:right w:val="single" w:color="D0CCE6" w:sz="4"/>
+            </w:tcBorders>
+            <w:tcMar>
+              <w:top w:type="dxa" w:w="80"/>
+              <w:left w:type="dxa" w:w="120"/>
+              <w:bottom w:type="dxa" w:w="80"/>
+              <w:right w:type="dxa" w:w="120"/>
+            </w:tcMar>
+          </w:tcPr>
+          <w:p>
+            <w:r>
+              <w:rPr>
+                <w:rFonts w:ascii="Arial" w:cs="Arial" w:eastAsia="Arial" w:hAnsi="Arial"/>
+                <w:b w:val="false"/>
+                <w:bCs w:val="false"/>
+                <w:sz w:val="20"/>
+                <w:szCs w:val="20"/>
+              </w:rPr>
+              <w:t xml:space="preserve">GitHub Pages publicado a partir de main/docs</w:t>
+            </w:r>
+          </w:p>
+        </w:tc>
+        <w:tc>
+          <w:tcPr>
+            <w:tcW w:type="dxa" w:w="3426"/>
+            <w:tcBorders>
+              <w:top w:val="single" w:color="D0CCE6" w:sz="4"/>
+              <w:left w:val="single" w:color="D0CCE6" w:sz="4"/>
+              <w:bottom w:val="single" w:color="D0CCE6" w:sz="4"/>
+              <w:right w:val="single" w:color="D0CCE6" w:sz="4"/>
+            </w:tcBorders>
+            <w:tcMar>
+              <w:top w:type="dxa" w:w="80"/>
+              <w:left w:type="dxa" w:w="120"/>
+              <w:bottom w:type="dxa" w:w="80"/>
+              <w:right w:type="dxa" w:w="120"/>
+            </w:tcMar>
+          </w:tcPr>
+          <w:p>
+            <w:r>
+              <w:rPr>
+                <w:rFonts w:ascii="Arial" w:cs="Arial" w:eastAsia="Arial" w:hAnsi="Arial"/>
+                <w:b w:val="false"/>
+                <w:bCs w:val="false"/>
+                <w:sz w:val="20"/>
+                <w:szCs w:val="20"/>
+              </w:rPr>
+              <w:t xml:space="preserve">OK (build concluído na versão v1.1)</w:t>
+            </w:r>
+          </w:p>
+        </w:tc>
+      </w:tr>
+      <w:tr>
+        <w:tc>
+          <w:tcPr>
+            <w:tcW w:type="dxa" w:w="5600"/>
+            <w:tcBorders>
+              <w:top w:val="single" w:color="D0CCE6" w:sz="4"/>
+              <w:left w:val="single" w:color="D0CCE6" w:sz="4"/>
+              <w:bottom w:val="single" w:color="D0CCE6" w:sz="4"/>
+              <w:right w:val="single" w:color="D0CCE6" w:sz="4"/>
+            </w:tcBorders>
+            <w:tcMar>
+              <w:top w:type="dxa" w:w="80"/>
+              <w:left w:type="dxa" w:w="120"/>
+              <w:bottom w:type="dxa" w:w="80"/>
+              <w:right w:type="dxa" w:w="120"/>
+            </w:tcMar>
+          </w:tcPr>
+          <w:p>
+            <w:r>
+              <w:rPr>
+                <w:rFonts w:ascii="Arial" w:cs="Arial" w:eastAsia="Arial" w:hAnsi="Arial"/>
+                <w:b w:val="false"/>
+                <w:bCs w:val="false"/>
+                <w:sz w:val="20"/>
+                <w:szCs w:val="20"/>
+              </w:rPr>
+              <w:t xml:space="preserve">Tags v1.0 e v1.1 enviadas ao GitHub</w:t>
+            </w:r>
+          </w:p>
+        </w:tc>
+        <w:tc>
+          <w:tcPr>
+            <w:tcW w:type="dxa" w:w="3426"/>
+            <w:tcBorders>
+              <w:top w:val="single" w:color="D0CCE6" w:sz="4"/>
+              <w:left w:val="single" w:color="D0CCE6" w:sz="4"/>
+              <w:bottom w:val="single" w:color="D0CCE6" w:sz="4"/>
+              <w:right w:val="single" w:color="D0CCE6" w:sz="4"/>
+            </w:tcBorders>
+            <w:tcMar>
+              <w:top w:type="dxa" w:w="80"/>
+              <w:left w:type="dxa" w:w="120"/>
+              <w:bottom w:type="dxa" w:w="80"/>
+              <w:right w:type="dxa" w:w="120"/>
+            </w:tcMar>
+          </w:tcPr>
+          <w:p>
+            <w:r>
+              <w:rPr>
+                <w:rFonts w:ascii="Arial" w:cs="Arial" w:eastAsia="Arial" w:hAnsi="Arial"/>
+                <w:b w:val="false"/>
+                <w:bCs w:val="false"/>
+                <w:sz w:val="20"/>
+                <w:szCs w:val="20"/>
+              </w:rPr>
+              <w:t xml:space="preserve">OK</w:t>
+            </w:r>
+          </w:p>
+        </w:tc>
+      </w:tr>
+      <w:tr>
+        <w:tc>
+          <w:tcPr>
+            <w:tcW w:type="dxa" w:w="5600"/>
+            <w:tcBorders>
+              <w:top w:val="single" w:color="D0CCE6" w:sz="4"/>
+              <w:left w:val="single" w:color="D0CCE6" w:sz="4"/>
+              <w:bottom w:val="single" w:color="D0CCE6" w:sz="4"/>
+              <w:right w:val="single" w:color="D0CCE6" w:sz="4"/>
+            </w:tcBorders>
+            <w:tcMar>
+              <w:top w:type="dxa" w:w="80"/>
+              <w:left w:type="dxa" w:w="120"/>
+              <w:bottom w:type="dxa" w:w="80"/>
+              <w:right w:type="dxa" w:w="120"/>
+            </w:tcMar>
+          </w:tcPr>
+          <w:p>
+            <w:r>
+              <w:rPr>
+                <w:rFonts w:ascii="Arial" w:cs="Arial" w:eastAsia="Arial" w:hAnsi="Arial"/>
+                <w:b w:val="false"/>
+                <w:bCs w:val="false"/>
+                <w:sz w:val="20"/>
+                <w:szCs w:val="20"/>
+              </w:rPr>
+              <w:t xml:space="preserve">Site no celular (menu recolhível e layout em coluna)</w:t>
+            </w:r>
+          </w:p>
+        </w:tc>
+        <w:tc>
+          <w:tcPr>
+            <w:tcW w:type="dxa" w:w="3426"/>
+            <w:tcBorders>
+              <w:top w:val="single" w:color="D0CCE6" w:sz="4"/>
+              <w:left w:val="single" w:color="D0CCE6" w:sz="4"/>
+              <w:bottom w:val="single" w:color="D0CCE6" w:sz="4"/>
+              <w:right w:val="single" w:color="D0CCE6" w:sz="4"/>
+            </w:tcBorders>
+            <w:tcMar>
+              <w:top w:type="dxa" w:w="80"/>
+              <w:left w:type="dxa" w:w="120"/>
+              <w:bottom w:type="dxa" w:w="80"/>
+              <w:right w:type="dxa" w:w="120"/>
+            </w:tcMar>
+          </w:tcPr>
+          <w:p>
+            <w:r>
+              <w:rPr>
+                <w:rFonts w:ascii="Arial" w:cs="Arial" w:eastAsia="Arial" w:hAnsi="Arial"/>
+                <w:b w:val="false"/>
+                <w:bCs w:val="false"/>
+                <w:sz w:val="20"/>
+                <w:szCs w:val="20"/>
+              </w:rPr>
+              <w:t xml:space="preserve">OK</w:t>
+            </w:r>
+          </w:p>
+        </w:tc>
+      </w:tr>
+      <w:tr>
+        <w:tc>
+          <w:tcPr>
+            <w:tcW w:type="dxa" w:w="5600"/>
+            <w:tcBorders>
+              <w:top w:val="single" w:color="D0CCE6" w:sz="4"/>
+              <w:left w:val="single" w:color="D0CCE6" w:sz="4"/>
+              <w:bottom w:val="single" w:color="D0CCE6" w:sz="4"/>
+              <w:right w:val="single" w:color="D0CCE6" w:sz="4"/>
+            </w:tcBorders>
+            <w:tcMar>
+              <w:top w:type="dxa" w:w="80"/>
+              <w:left w:type="dxa" w:w="120"/>
+              <w:bottom w:type="dxa" w:w="80"/>
+              <w:right w:type="dxa" w:w="120"/>
+            </w:tcMar>
+          </w:tcPr>
+          <w:p>
+            <w:r>
+              <w:rPr>
+                <w:rFonts w:ascii="Arial" w:cs="Arial" w:eastAsia="Arial" w:hAnsi="Arial"/>
+                <w:b w:val="false"/>
+                <w:bCs w:val="false"/>
+                <w:sz w:val="20"/>
+                <w:szCs w:val="20"/>
+              </w:rPr>
+              <w:t xml:space="preserve">Site no computador (menu completo e cards lado a lado)</w:t>
+            </w:r>
+          </w:p>
+        </w:tc>
+        <w:tc>
+          <w:tcPr>
+            <w:tcW w:type="dxa" w:w="3426"/>
+            <w:tcBorders>
+              <w:top w:val="single" w:color="D0CCE6" w:sz="4"/>
+              <w:left w:val="single" w:color="D0CCE6" w:sz="4"/>
+              <w:bottom w:val="single" w:color="D0CCE6" w:sz="4"/>
+              <w:right w:val="single" w:color="D0CCE6" w:sz="4"/>
+            </w:tcBorders>
+            <w:tcMar>
+              <w:top w:type="dxa" w:w="80"/>
+              <w:left w:type="dxa" w:w="120"/>
+              <w:bottom w:type="dxa" w:w="80"/>
+              <w:right w:type="dxa" w:w="120"/>
+            </w:tcMar>
+          </w:tcPr>
+          <w:p>
+            <w:r>
+              <w:rPr>
+                <w:rFonts w:ascii="Arial" w:cs="Arial" w:eastAsia="Arial" w:hAnsi="Arial"/>
+                <w:b w:val="false"/>
+                <w:bCs w:val="false"/>
+                <w:sz w:val="20"/>
+                <w:szCs w:val="20"/>
+              </w:rPr>
+              <w:t xml:space="preserve">OK</w:t>
+            </w:r>
+          </w:p>
+        </w:tc>
+      </w:tr>
+      <w:tr>
+        <w:tc>
+          <w:tcPr>
+            <w:tcW w:type="dxa" w:w="5600"/>
+            <w:tcBorders>
+              <w:top w:val="single" w:color="D0CCE6" w:sz="4"/>
+              <w:left w:val="single" w:color="D0CCE6" w:sz="4"/>
+              <w:bottom w:val="single" w:color="D0CCE6" w:sz="4"/>
+              <w:right w:val="single" w:color="D0CCE6" w:sz="4"/>
+            </w:tcBorders>
+            <w:tcMar>
+              <w:top w:type="dxa" w:w="80"/>
+              <w:left w:type="dxa" w:w="120"/>
+              <w:bottom w:type="dxa" w:w="80"/>
+              <w:right w:type="dxa" w:w="120"/>
+            </w:tcMar>
+          </w:tcPr>
+          <w:p>
+            <w:r>
+              <w:rPr>
+                <w:rFonts w:ascii="Arial" w:cs="Arial" w:eastAsia="Arial" w:hAnsi="Arial"/>
+                <w:b w:val="false"/>
+                <w:bCs w:val="false"/>
+                <w:sz w:val="20"/>
+                <w:szCs w:val="20"/>
+              </w:rPr>
+              <w:t xml:space="preserve">Console do navegador sem erros</w:t>
+            </w:r>
+          </w:p>
+        </w:tc>
+        <w:tc>
+          <w:tcPr>
+            <w:tcW w:type="dxa" w:w="3426"/>
+            <w:tcBorders>
+              <w:top w:val="single" w:color="D0CCE6" w:sz="4"/>
+              <w:left w:val="single" w:color="D0CCE6" w:sz="4"/>
+              <w:bottom w:val="single" w:color="D0CCE6" w:sz="4"/>
+              <w:right w:val="single" w:color="D0CCE6" w:sz="4"/>
+            </w:tcBorders>
+            <w:tcMar>
+              <w:top w:type="dxa" w:w="80"/>
+              <w:left w:type="dxa" w:w="120"/>
+              <w:bottom w:type="dxa" w:w="80"/>
+              <w:right w:type="dxa" w:w="120"/>
+            </w:tcMar>
+          </w:tcPr>
+          <w:p>
+            <w:r>
+              <w:rPr>
+                <w:rFonts w:ascii="Arial" w:cs="Arial" w:eastAsia="Arial" w:hAnsi="Arial"/>
+                <w:b w:val="false"/>
+                <w:bCs w:val="false"/>
+                <w:sz w:val="20"/>
+                <w:szCs w:val="20"/>
+              </w:rPr>
+              <w:t xml:space="preserve">OK</w:t>
+            </w:r>
+          </w:p>
+        </w:tc>
+      </w:tr>
+      <w:tr>
+        <w:tc>
+          <w:tcPr>
+            <w:tcW w:type="dxa" w:w="5600"/>
+            <w:tcBorders>
+              <w:top w:val="single" w:color="D0CCE6" w:sz="4"/>
+              <w:left w:val="single" w:color="D0CCE6" w:sz="4"/>
+              <w:bottom w:val="single" w:color="D0CCE6" w:sz="4"/>
+              <w:right w:val="single" w:color="D0CCE6" w:sz="4"/>
+            </w:tcBorders>
+            <w:tcMar>
+              <w:top w:type="dxa" w:w="80"/>
+              <w:left w:type="dxa" w:w="120"/>
+              <w:bottom w:type="dxa" w:w="80"/>
+              <w:right w:type="dxa" w:w="120"/>
+            </w:tcMar>
+          </w:tcPr>
+          <w:p>
+            <w:r>
+              <w:rPr>
+                <w:rFonts w:ascii="Arial" w:cs="Arial" w:eastAsia="Arial" w:hAnsi="Arial"/>
+                <w:b w:val="false"/>
+                <w:bCs w:val="false"/>
+                <w:sz w:val="20"/>
+                <w:szCs w:val="20"/>
+              </w:rPr>
+              <w:t xml:space="preserve">Links externos (GitHub, LinkedIn e documentos)</w:t>
+            </w:r>
+          </w:p>
+        </w:tc>
+        <w:tc>
+          <w:tcPr>
+            <w:tcW w:type="dxa" w:w="3426"/>
+            <w:tcBorders>
+              <w:top w:val="single" w:color="D0CCE6" w:sz="4"/>
+              <w:left w:val="single" w:color="D0CCE6" w:sz="4"/>
+              <w:bottom w:val="single" w:color="D0CCE6" w:sz="4"/>
+              <w:right w:val="single" w:color="D0CCE6" w:sz="4"/>
+            </w:tcBorders>
+            <w:tcMar>
+              <w:top w:type="dxa" w:w="80"/>
+              <w:left w:type="dxa" w:w="120"/>
+              <w:bottom w:type="dxa" w:w="80"/>
+              <w:right w:type="dxa" w:w="120"/>
+            </w:tcMar>
+          </w:tcPr>
+          <w:p>
+            <w:r>
+              <w:rPr>
+                <w:rFonts w:ascii="Arial" w:cs="Arial" w:eastAsia="Arial" w:hAnsi="Arial"/>
+                <w:b w:val="false"/>
+                <w:bCs w:val="false"/>
+                <w:sz w:val="20"/>
+                <w:szCs w:val="20"/>
+              </w:rPr>
+              <w:t xml:space="preserve">OK</w:t>
+            </w:r>
+          </w:p>
+        </w:tc>
+      </w:tr>
+      <w:tr>
+        <w:tc>
+          <w:tcPr>
+            <w:tcW w:type="dxa" w:w="5600"/>
+            <w:tcBorders>
+              <w:top w:val="single" w:color="D0CCE6" w:sz="4"/>
+              <w:left w:val="single" w:color="D0CCE6" w:sz="4"/>
+              <w:bottom w:val="single" w:color="D0CCE6" w:sz="4"/>
+              <w:right w:val="single" w:color="D0CCE6" w:sz="4"/>
+            </w:tcBorders>
+            <w:tcMar>
+              <w:top w:type="dxa" w:w="80"/>
+              <w:left w:type="dxa" w:w="120"/>
+              <w:bottom w:type="dxa" w:w="80"/>
+              <w:right w:type="dxa" w:w="120"/>
+            </w:tcMar>
+          </w:tcPr>
+          <w:p>
+            <w:r>
+              <w:rPr>
+                <w:rFonts w:ascii="Arial" w:cs="Arial" w:eastAsia="Arial" w:hAnsi="Arial"/>
+                <w:b w:val="false"/>
+                <w:bCs w:val="false"/>
+                <w:sz w:val="20"/>
+                <w:szCs w:val="20"/>
+              </w:rPr>
+              <w:t xml:space="preserve">Projeto em repositório privado (CashFlow) sem link quebrado</w:t>
+            </w:r>
+          </w:p>
+        </w:tc>
+        <w:tc>
+          <w:tcPr>
+            <w:tcW w:type="dxa" w:w="3426"/>
+            <w:tcBorders>
+              <w:top w:val="single" w:color="D0CCE6" w:sz="4"/>
+              <w:left w:val="single" w:color="D0CCE6" w:sz="4"/>
+              <w:bottom w:val="single" w:color="D0CCE6" w:sz="4"/>
+              <w:right w:val="single" w:color="D0CCE6" w:sz="4"/>
+            </w:tcBorders>
+            <w:tcMar>
+              <w:top w:type="dxa" w:w="80"/>
+              <w:left w:type="dxa" w:w="120"/>
+              <w:bottom w:type="dxa" w:w="80"/>
+              <w:right w:type="dxa" w:w="120"/>
+            </w:tcMar>
+          </w:tcPr>
+          <w:p>
+            <w:r>
+              <w:rPr>
+                <w:rFonts w:ascii="Arial" w:cs="Arial" w:eastAsia="Arial" w:hAnsi="Arial"/>
+                <w:b w:val="false"/>
+                <w:bCs w:val="false"/>
+                <w:sz w:val="20"/>
+                <w:szCs w:val="20"/>
+              </w:rPr>
+              <w:t xml:space="preserve">OK (indicado como repositório privado da equipe)</w:t>
+            </w:r>
+          </w:p>
+        </w:tc>
+      </w:tr>
+      <w:tr>
+        <w:tc>
+          <w:tcPr>
+            <w:tcW w:type="dxa" w:w="5600"/>
+            <w:tcBorders>
+              <w:top w:val="single" w:color="D0CCE6" w:sz="4"/>
+              <w:left w:val="single" w:color="D0CCE6" w:sz="4"/>
+              <w:bottom w:val="single" w:color="D0CCE6" w:sz="4"/>
+              <w:right w:val="single" w:color="D0CCE6" w:sz="4"/>
+            </w:tcBorders>
+            <w:tcMar>
+              <w:top w:type="dxa" w:w="80"/>
+              <w:left w:type="dxa" w:w="120"/>
+              <w:bottom w:type="dxa" w:w="80"/>
+              <w:right w:type="dxa" w:w="120"/>
+            </w:tcMar>
+          </w:tcPr>
+          <w:p>
+            <w:r>
+              <w:rPr>
+                <w:rFonts w:ascii="Arial" w:cs="Arial" w:eastAsia="Arial" w:hAnsi="Arial"/>
+                <w:b w:val="false"/>
+                <w:bCs w:val="false"/>
+                <w:sz w:val="20"/>
+                <w:szCs w:val="20"/>
+              </w:rPr>
+              <w:t xml:space="preserve">README em cada projeto e disciplina</w:t>
+            </w:r>
+          </w:p>
+        </w:tc>
+        <w:tc>
+          <w:tcPr>
+            <w:tcW w:type="dxa" w:w="3426"/>
+            <w:tcBorders>
+              <w:top w:val="single" w:color="D0CCE6" w:sz="4"/>
+              <w:left w:val="single" w:color="D0CCE6" w:sz="4"/>
+              <w:bottom w:val="single" w:color="D0CCE6" w:sz="4"/>
+              <w:right w:val="single" w:color="D0CCE6" w:sz="4"/>
+            </w:tcBorders>
+            <w:tcMar>
+              <w:top w:type="dxa" w:w="80"/>
+              <w:left w:type="dxa" w:w="120"/>
+              <w:bottom w:type="dxa" w:w="80"/>
+              <w:right w:type="dxa" w:w="120"/>
+            </w:tcMar>
+          </w:tcPr>
+          <w:p>
+            <w:r>
+              <w:rPr>
+                <w:rFonts w:ascii="Arial" w:cs="Arial" w:eastAsia="Arial" w:hAnsi="Arial"/>
+                <w:b w:val="false"/>
+                <w:bCs w:val="false"/>
+                <w:sz w:val="20"/>
+                <w:szCs w:val="20"/>
+              </w:rPr>
+              <w:t xml:space="preserve">OK</w:t>
+            </w:r>
+          </w:p>
+        </w:tc>
+      </w:tr>
+      <w:tr>
+        <w:tc>
+          <w:tcPr>
+            <w:tcW w:type="dxa" w:w="5600"/>
+            <w:tcBorders>
+              <w:top w:val="single" w:color="D0CCE6" w:sz="4"/>
+              <w:left w:val="single" w:color="D0CCE6" w:sz="4"/>
+              <w:bottom w:val="single" w:color="D0CCE6" w:sz="4"/>
+              <w:right w:val="single" w:color="D0CCE6" w:sz="4"/>
+            </w:tcBorders>
+            <w:tcMar>
+              <w:top w:type="dxa" w:w="80"/>
+              <w:left w:type="dxa" w:w="120"/>
+              <w:bottom w:type="dxa" w:w="80"/>
+              <w:right w:type="dxa" w:w="120"/>
+            </w:tcMar>
+          </w:tcPr>
+          <w:p>
+            <w:r>
+              <w:rPr>
+                <w:rFonts w:ascii="Arial" w:cs="Arial" w:eastAsia="Arial" w:hAnsi="Arial"/>
+                <w:b w:val="false"/>
+                <w:bCs w:val="false"/>
+                <w:sz w:val="20"/>
+                <w:szCs w:val="20"/>
+              </w:rPr>
+              <w:t xml:space="preserve">Padronização visual dos READMEs (sem emojis e sem linhas horizontais)</w:t>
+            </w:r>
+          </w:p>
+        </w:tc>
+        <w:tc>
+          <w:tcPr>
+            <w:tcW w:type="dxa" w:w="3426"/>
+            <w:tcBorders>
+              <w:top w:val="single" w:color="D0CCE6" w:sz="4"/>
+              <w:left w:val="single" w:color="D0CCE6" w:sz="4"/>
+              <w:bottom w:val="single" w:color="D0CCE6" w:sz="4"/>
+              <w:right w:val="single" w:color="D0CCE6" w:sz="4"/>
+            </w:tcBorders>
+            <w:tcMar>
+              <w:top w:type="dxa" w:w="80"/>
+              <w:left w:type="dxa" w:w="120"/>
+              <w:bottom w:type="dxa" w:w="80"/>
+              <w:right w:type="dxa" w:w="120"/>
+            </w:tcMar>
+          </w:tcPr>
+          <w:p>
+            <w:r>
+              <w:rPr>
+                <w:rFonts w:ascii="Arial" w:cs="Arial" w:eastAsia="Arial" w:hAnsi="Arial"/>
+                <w:b w:val="false"/>
+                <w:bCs w:val="false"/>
+                <w:sz w:val="20"/>
+                <w:szCs w:val="20"/>
+              </w:rPr>
+              <w:t xml:space="preserve">OK</w:t>
+            </w:r>
+          </w:p>
+        </w:tc>
+      </w:tr>
+    </w:tbl>
+    <w:p>
+      <w:pPr>
+        <w:spacing w:after="120"/>
+      </w:pPr>
+    </w:p>
+    <w:p>
+      <w:pPr>
+        <w:pStyle w:val="Heading2"/>
+      </w:pPr>
       <w:bookmarkStart w:name="_Toc22" w:id="22"/>
       <w:r>
         <w:rPr>
           <w:rFonts w:ascii="Arial" w:cs="Arial" w:eastAsia="Arial" w:hAnsi="Arial"/>
         </w:rPr>
+        <w:t xml:space="preserve">Principais projetos do repositório</w:t>
+      </w:r>
+      <w:bookmarkEnd w:id="22"/>
+    </w:p>
+    <w:p>
+      <w:pPr>
+        <w:pStyle w:val="ListParagraph"/>
+        <w:numPr>
+          <w:ilvl w:val="0"/>
+          <w:numId w:val="2"/>
+        </w:numPr>
+        <w:spacing w:after="60" w:line="288"/>
+      </w:pPr>
+      <w:r>
+        <w:rPr>
+          <w:rFonts w:ascii="Arial" w:cs="Arial" w:eastAsia="Arial" w:hAnsi="Arial"/>
+          <w:b/>
+          <w:bCs/>
+        </w:rPr>
+        <w:t xml:space="preserve">Study Hub e Portfólio</w:t>
+      </w:r>
+      <w:r>
+        <w:rPr>
+          <w:rFonts w:ascii="Arial" w:cs="Arial" w:eastAsia="Arial" w:hAnsi="Arial"/>
+        </w:rPr>
+        <w:t xml:space="preserve">: repositório organizado e site pessoal publicado no GitHub Pages (HTML, CSS e JavaScript).</w:t>
+      </w:r>
+    </w:p>
+    <w:p>
+      <w:pPr>
+        <w:pStyle w:val="ListParagraph"/>
+        <w:numPr>
+          <w:ilvl w:val="0"/>
+          <w:numId w:val="2"/>
+        </w:numPr>
+        <w:spacing w:after="60" w:line="288"/>
+      </w:pPr>
+      <w:r>
+        <w:rPr>
+          <w:rFonts w:ascii="Arial" w:cs="Arial" w:eastAsia="Arial" w:hAnsi="Arial"/>
+          <w:b/>
+          <w:bCs/>
+        </w:rPr>
+        <w:t xml:space="preserve">CashFlow</w:t>
+      </w:r>
+      <w:r>
+        <w:rPr>
+          <w:rFonts w:ascii="Arial" w:cs="Arial" w:eastAsia="Arial" w:hAnsi="Arial"/>
+        </w:rPr>
+        <w:t xml:space="preserve">: app web de controle financeiro pessoal, Projeto Integrador desenvolvido em equipe (HTML, CSS, JavaScript e PHP).</w:t>
+      </w:r>
+    </w:p>
+    <w:p>
+      <w:pPr>
+        <w:pStyle w:val="ListParagraph"/>
+        <w:numPr>
+          <w:ilvl w:val="0"/>
+          <w:numId w:val="2"/>
+        </w:numPr>
+        <w:spacing w:after="60" w:line="288"/>
+      </w:pPr>
+      <w:r>
+        <w:rPr>
+          <w:rFonts w:ascii="Arial" w:cs="Arial" w:eastAsia="Arial" w:hAnsi="Arial"/>
+          <w:b/>
+          <w:bCs/>
+        </w:rPr>
+        <w:t xml:space="preserve">Web Design</w:t>
+      </w:r>
+      <w:r>
+        <w:rPr>
+          <w:rFonts w:ascii="Arial" w:cs="Arial" w:eastAsia="Arial" w:hAnsi="Arial"/>
+        </w:rPr>
+        <w:t xml:space="preserve">: primeiro projeto autoral em HTML e CSS, com design no Figma.</w:t>
+      </w:r>
+    </w:p>
+    <w:p>
+      <w:pPr>
+        <w:pStyle w:val="Heading1"/>
+      </w:pPr>
+      <w:bookmarkStart w:name="_Toc23" w:id="23"/>
+      <w:r>
+        <w:rPr>
+          <w:rFonts w:ascii="Arial" w:cs="Arial" w:eastAsia="Arial" w:hAnsi="Arial"/>
+        </w:rPr>
         <w:t xml:space="preserve">Atendimento aos Critérios de Avaliação</w:t>
       </w:r>
-      <w:bookmarkEnd w:id="22"/>
+      <w:bookmarkEnd w:id="23"/>
     </w:p>
     <w:tbl>
       <w:tblPr>
@@ -4730,7 +5330,7 @@
                 <w:sz w:val="20"/>
                 <w:szCs w:val="20"/>
               </w:rPr>
-              <w:t xml:space="preserve">Projeto no LinkedIn com links para o site e o repositório, e links do LinkedIn no site (seção 5).</w:t>
+              <w:t xml:space="preserve">Links para o perfil do LinkedIn no menu, no contato e no rodapé do site, e nos READMEs (seção 5).</w:t>
             </w:r>
           </w:p>
         </w:tc>
@@ -4850,7 +5450,7 @@
                 <w:sz w:val="20"/>
                 <w:szCs w:val="20"/>
               </w:rPr>
-              <w:t xml:space="preserve">Vídeo de 5 minutos no YouTube com roteiro definido (seção 6).</w:t>
+              <w:t xml:space="preserve">Revisão final documentada e principais projetos destacados (seção 6), com o portfólio publicado como vitrine do repositório.</w:t>
             </w:r>
           </w:p>
         </w:tc>

</xml_diff>